<commit_message>
02: estabilidad con Spearman y gráficos G01 y G03 recortados
Co-Authored-By: Claude Sonnet 5 <noreply@anthropic.com>
</commit_message>
<xml_diff>
--- a/4. RESULTADOS/02_medidas_exposicion/00_compendio_tablas.docx
+++ b/4. RESULTADOS/02_medidas_exposicion/00_compendio_tablas.docx
@@ -6097,7 +6097,7 @@
         <w:tblLook w:firstRow="1" w:lastRow="0" w:firstColumn="0" w:lastColumn="0" w:noHBand="0" w:noVBand="1"/>
       </w:tblPr>
       <w:tblGrid>
-        <w:gridCol w:w="3249"/>
+        <w:gridCol w:w="3921"/>
         <w:gridCol w:w="1512"/>
       </w:tblGrid>
       <w:tr>
@@ -6386,7 +6386,7 @@
                 <w:szCs w:val="22"/>
                 <w:color w:val="000000"/>
               </w:rPr>
-              <w:t xml:space="preserve">cor_golpe_c_2022_2019</w:t>
+              <w:t xml:space="preserve">pearson_golpe_c_2022_2019</w:t>
             </w:r>
           </w:p>
         </w:tc>
@@ -6501,7 +6501,122 @@
                 <w:szCs w:val="22"/>
                 <w:color w:val="000000"/>
               </w:rPr>
-              <w:t xml:space="preserve">cor_golpe_a_2022_2019</w:t>
+              <w:t xml:space="preserve">spearman_golpe_c_2022_2019</w:t>
+            </w:r>
+          </w:p>
+        </w:tc>
+        <w:tc>
+          <w:tcPr>
+            <w:tcBorders>
+              <w:bottom w:val="none" w:sz="0" w:space="0" w:color="000000"/>
+              <w:top w:val="none" w:sz="0" w:space="0" w:color="000000"/>
+              <w:left w:val="none" w:sz="0" w:space="0" w:color="000000"/>
+              <w:right w:val="none" w:sz="0" w:space="0" w:color="000000"/>
+            </w:tcBorders>
+            <w:shd w:val="clear" w:color="auto" w:fill="FFFFFF"/>
+            <w:tcMar>
+              <w:top w:w="0" w:type="dxa"/>
+              <w:bottom w:w="0" w:type="dxa"/>
+              <w:left w:w="0" w:type="dxa"/>
+              <w:right w:w="0" w:type="dxa"/>
+            </w:tcMar>
+            <w:vAlign w:val="center"/>
+          </w:tcPr>
+          <w:p>
+            <w:pPr>
+              <w:pStyle w:val="Normal"/>
+              <w:jc w:val="right"/>
+              <w:pBdr>
+                <w:bottom w:val="none" w:sz="0" w:space="0" w:color="000000"/>
+                <w:top w:val="none" w:sz="0" w:space="0" w:color="000000"/>
+                <w:left w:val="none" w:sz="0" w:space="0" w:color="000000"/>
+                <w:right w:val="none" w:sz="0" w:space="0" w:color="000000"/>
+              </w:pBdr>
+              <w:spacing w:after="100" w:before="100" w:line="240"/>
+              <w:ind w:left="100" w:right="100" w:firstLine="0" w:firstLineChars="0"/>
+              <w:rPr>
+                <w:rFonts w:ascii="Arial" w:hAnsi="Arial" w:eastAsia="Arial" w:cs="Arial"/>
+                <w:i w:val="false"/>
+                <w:b w:val="false"/>
+                <w:u w:val="none"/>
+                <w:strike w:val="false"/>
+                <w:sz w:val="22"/>
+                <w:szCs w:val="22"/>
+                <w:color w:val="000000"/>
+              </w:rPr>
+            </w:pPr>
+            <w:r>
+              <w:rPr>
+                <w:rFonts w:ascii="Arial" w:hAnsi="Arial" w:eastAsia="Arial" w:cs="Arial"/>
+                <w:i w:val="false"/>
+                <w:b w:val="false"/>
+                <w:u w:val="none"/>
+                <w:strike w:val="false"/>
+                <w:sz w:val="22"/>
+                <w:szCs w:val="22"/>
+                <w:color w:val="000000"/>
+              </w:rPr>
+              <w:t xml:space="preserve">0.7202</w:t>
+            </w:r>
+          </w:p>
+        </w:tc>
+      </w:tr>
+      <w:tr>
+        <w:trPr>
+          <w:trHeight w:val="608" w:hRule="auto"/>
+        </w:trPr>
+        <w:tc>
+          <w:tcPr>
+            <w:tcBorders>
+              <w:bottom w:val="none" w:sz="0" w:space="0" w:color="000000"/>
+              <w:top w:val="none" w:sz="0" w:space="0" w:color="000000"/>
+              <w:left w:val="none" w:sz="0" w:space="0" w:color="000000"/>
+              <w:right w:val="none" w:sz="0" w:space="0" w:color="000000"/>
+            </w:tcBorders>
+            <w:shd w:val="clear" w:color="auto" w:fill="FFFFFF"/>
+            <w:tcMar>
+              <w:top w:w="0" w:type="dxa"/>
+              <w:bottom w:w="0" w:type="dxa"/>
+              <w:left w:w="0" w:type="dxa"/>
+              <w:right w:w="0" w:type="dxa"/>
+            </w:tcMar>
+            <w:vAlign w:val="center"/>
+          </w:tcPr>
+          <w:p>
+            <w:pPr>
+              <w:pStyle w:val="Normal"/>
+              <w:jc w:val="left"/>
+              <w:pBdr>
+                <w:bottom w:val="none" w:sz="0" w:space="0" w:color="000000"/>
+                <w:top w:val="none" w:sz="0" w:space="0" w:color="000000"/>
+                <w:left w:val="none" w:sz="0" w:space="0" w:color="000000"/>
+                <w:right w:val="none" w:sz="0" w:space="0" w:color="000000"/>
+              </w:pBdr>
+              <w:spacing w:after="100" w:before="100" w:line="240"/>
+              <w:ind w:left="100" w:right="100" w:firstLine="0" w:firstLineChars="0"/>
+              <w:rPr>
+                <w:rFonts w:ascii="Arial" w:hAnsi="Arial" w:eastAsia="Arial" w:cs="Arial"/>
+                <w:i w:val="false"/>
+                <w:b w:val="false"/>
+                <w:u w:val="none"/>
+                <w:strike w:val="false"/>
+                <w:sz w:val="22"/>
+                <w:szCs w:val="22"/>
+                <w:color w:val="000000"/>
+              </w:rPr>
+            </w:pPr>
+            <w:r>
+              <w:rPr>
+                <w:rFonts w:ascii="Arial" w:hAnsi="Arial" w:eastAsia="Arial" w:cs="Arial"/>
+                <w:i w:val="false"/>
+                <w:b w:val="false"/>
+                <w:u w:val="none"/>
+                <w:strike w:val="false"/>
+                <w:sz w:val="22"/>
+                <w:szCs w:val="22"/>
+                <w:color w:val="000000"/>
+              </w:rPr>
+              <w:t xml:space="preserve">pearson_golpe_a_2022_2019</w:t>
             </w:r>
           </w:p>
         </w:tc>
@@ -6557,6 +6672,236 @@
                 <w:color w:val="000000"/>
               </w:rPr>
               <w:t xml:space="preserve">-0.0247</w:t>
+            </w:r>
+          </w:p>
+        </w:tc>
+      </w:tr>
+      <w:tr>
+        <w:trPr>
+          <w:trHeight w:val="608" w:hRule="auto"/>
+        </w:trPr>
+        <w:tc>
+          <w:tcPr>
+            <w:tcBorders>
+              <w:bottom w:val="none" w:sz="0" w:space="0" w:color="000000"/>
+              <w:top w:val="none" w:sz="0" w:space="0" w:color="000000"/>
+              <w:left w:val="none" w:sz="0" w:space="0" w:color="000000"/>
+              <w:right w:val="none" w:sz="0" w:space="0" w:color="000000"/>
+            </w:tcBorders>
+            <w:shd w:val="clear" w:color="auto" w:fill="FFFFFF"/>
+            <w:tcMar>
+              <w:top w:w="0" w:type="dxa"/>
+              <w:bottom w:w="0" w:type="dxa"/>
+              <w:left w:w="0" w:type="dxa"/>
+              <w:right w:w="0" w:type="dxa"/>
+            </w:tcMar>
+            <w:vAlign w:val="center"/>
+          </w:tcPr>
+          <w:p>
+            <w:pPr>
+              <w:pStyle w:val="Normal"/>
+              <w:jc w:val="left"/>
+              <w:pBdr>
+                <w:bottom w:val="none" w:sz="0" w:space="0" w:color="000000"/>
+                <w:top w:val="none" w:sz="0" w:space="0" w:color="000000"/>
+                <w:left w:val="none" w:sz="0" w:space="0" w:color="000000"/>
+                <w:right w:val="none" w:sz="0" w:space="0" w:color="000000"/>
+              </w:pBdr>
+              <w:spacing w:after="100" w:before="100" w:line="240"/>
+              <w:ind w:left="100" w:right="100" w:firstLine="0" w:firstLineChars="0"/>
+              <w:rPr>
+                <w:rFonts w:ascii="Arial" w:hAnsi="Arial" w:eastAsia="Arial" w:cs="Arial"/>
+                <w:i w:val="false"/>
+                <w:b w:val="false"/>
+                <w:u w:val="none"/>
+                <w:strike w:val="false"/>
+                <w:sz w:val="22"/>
+                <w:szCs w:val="22"/>
+                <w:color w:val="000000"/>
+              </w:rPr>
+            </w:pPr>
+            <w:r>
+              <w:rPr>
+                <w:rFonts w:ascii="Arial" w:hAnsi="Arial" w:eastAsia="Arial" w:cs="Arial"/>
+                <w:i w:val="false"/>
+                <w:b w:val="false"/>
+                <w:u w:val="none"/>
+                <w:strike w:val="false"/>
+                <w:sz w:val="22"/>
+                <w:szCs w:val="22"/>
+                <w:color w:val="000000"/>
+              </w:rPr>
+              <w:t xml:space="preserve">spearman_golpe_a_2022_2019</w:t>
+            </w:r>
+          </w:p>
+        </w:tc>
+        <w:tc>
+          <w:tcPr>
+            <w:tcBorders>
+              <w:bottom w:val="none" w:sz="0" w:space="0" w:color="000000"/>
+              <w:top w:val="none" w:sz="0" w:space="0" w:color="000000"/>
+              <w:left w:val="none" w:sz="0" w:space="0" w:color="000000"/>
+              <w:right w:val="none" w:sz="0" w:space="0" w:color="000000"/>
+            </w:tcBorders>
+            <w:shd w:val="clear" w:color="auto" w:fill="FFFFFF"/>
+            <w:tcMar>
+              <w:top w:w="0" w:type="dxa"/>
+              <w:bottom w:w="0" w:type="dxa"/>
+              <w:left w:w="0" w:type="dxa"/>
+              <w:right w:w="0" w:type="dxa"/>
+            </w:tcMar>
+            <w:vAlign w:val="center"/>
+          </w:tcPr>
+          <w:p>
+            <w:pPr>
+              <w:pStyle w:val="Normal"/>
+              <w:jc w:val="right"/>
+              <w:pBdr>
+                <w:bottom w:val="none" w:sz="0" w:space="0" w:color="000000"/>
+                <w:top w:val="none" w:sz="0" w:space="0" w:color="000000"/>
+                <w:left w:val="none" w:sz="0" w:space="0" w:color="000000"/>
+                <w:right w:val="none" w:sz="0" w:space="0" w:color="000000"/>
+              </w:pBdr>
+              <w:spacing w:after="100" w:before="100" w:line="240"/>
+              <w:ind w:left="100" w:right="100" w:firstLine="0" w:firstLineChars="0"/>
+              <w:rPr>
+                <w:rFonts w:ascii="Arial" w:hAnsi="Arial" w:eastAsia="Arial" w:cs="Arial"/>
+                <w:i w:val="false"/>
+                <w:b w:val="false"/>
+                <w:u w:val="none"/>
+                <w:strike w:val="false"/>
+                <w:sz w:val="22"/>
+                <w:szCs w:val="22"/>
+                <w:color w:val="000000"/>
+              </w:rPr>
+            </w:pPr>
+            <w:r>
+              <w:rPr>
+                <w:rFonts w:ascii="Arial" w:hAnsi="Arial" w:eastAsia="Arial" w:cs="Arial"/>
+                <w:i w:val="false"/>
+                <w:b w:val="false"/>
+                <w:u w:val="none"/>
+                <w:strike w:val="false"/>
+                <w:sz w:val="22"/>
+                <w:szCs w:val="22"/>
+                <w:color w:val="000000"/>
+              </w:rPr>
+              <w:t xml:space="preserve">0.7329</w:t>
+            </w:r>
+          </w:p>
+        </w:tc>
+      </w:tr>
+      <w:tr>
+        <w:trPr>
+          <w:trHeight w:val="608" w:hRule="auto"/>
+        </w:trPr>
+        <w:tc>
+          <w:tcPr>
+            <w:tcBorders>
+              <w:bottom w:val="none" w:sz="0" w:space="0" w:color="000000"/>
+              <w:top w:val="none" w:sz="0" w:space="0" w:color="000000"/>
+              <w:left w:val="none" w:sz="0" w:space="0" w:color="000000"/>
+              <w:right w:val="none" w:sz="0" w:space="0" w:color="000000"/>
+            </w:tcBorders>
+            <w:shd w:val="clear" w:color="auto" w:fill="FFFFFF"/>
+            <w:tcMar>
+              <w:top w:w="0" w:type="dxa"/>
+              <w:bottom w:w="0" w:type="dxa"/>
+              <w:left w:w="0" w:type="dxa"/>
+              <w:right w:w="0" w:type="dxa"/>
+            </w:tcMar>
+            <w:vAlign w:val="center"/>
+          </w:tcPr>
+          <w:p>
+            <w:pPr>
+              <w:pStyle w:val="Normal"/>
+              <w:jc w:val="left"/>
+              <w:pBdr>
+                <w:bottom w:val="none" w:sz="0" w:space="0" w:color="000000"/>
+                <w:top w:val="none" w:sz="0" w:space="0" w:color="000000"/>
+                <w:left w:val="none" w:sz="0" w:space="0" w:color="000000"/>
+                <w:right w:val="none" w:sz="0" w:space="0" w:color="000000"/>
+              </w:pBdr>
+              <w:spacing w:after="100" w:before="100" w:line="240"/>
+              <w:ind w:left="100" w:right="100" w:firstLine="0" w:firstLineChars="0"/>
+              <w:rPr>
+                <w:rFonts w:ascii="Arial" w:hAnsi="Arial" w:eastAsia="Arial" w:cs="Arial"/>
+                <w:i w:val="false"/>
+                <w:b w:val="false"/>
+                <w:u w:val="none"/>
+                <w:strike w:val="false"/>
+                <w:sz w:val="22"/>
+                <w:szCs w:val="22"/>
+                <w:color w:val="000000"/>
+              </w:rPr>
+            </w:pPr>
+            <w:r>
+              <w:rPr>
+                <w:rFonts w:ascii="Arial" w:hAnsi="Arial" w:eastAsia="Arial" w:cs="Arial"/>
+                <w:i w:val="false"/>
+                <w:b w:val="false"/>
+                <w:u w:val="none"/>
+                <w:strike w:val="false"/>
+                <w:sz w:val="22"/>
+                <w:szCs w:val="22"/>
+                <w:color w:val="000000"/>
+              </w:rPr>
+              <w:t xml:space="preserve">pearson_golpe_costo_2022_2019</w:t>
+            </w:r>
+          </w:p>
+        </w:tc>
+        <w:tc>
+          <w:tcPr>
+            <w:tcBorders>
+              <w:bottom w:val="none" w:sz="0" w:space="0" w:color="000000"/>
+              <w:top w:val="none" w:sz="0" w:space="0" w:color="000000"/>
+              <w:left w:val="none" w:sz="0" w:space="0" w:color="000000"/>
+              <w:right w:val="none" w:sz="0" w:space="0" w:color="000000"/>
+            </w:tcBorders>
+            <w:shd w:val="clear" w:color="auto" w:fill="FFFFFF"/>
+            <w:tcMar>
+              <w:top w:w="0" w:type="dxa"/>
+              <w:bottom w:w="0" w:type="dxa"/>
+              <w:left w:w="0" w:type="dxa"/>
+              <w:right w:w="0" w:type="dxa"/>
+            </w:tcMar>
+            <w:vAlign w:val="center"/>
+          </w:tcPr>
+          <w:p>
+            <w:pPr>
+              <w:pStyle w:val="Normal"/>
+              <w:jc w:val="right"/>
+              <w:pBdr>
+                <w:bottom w:val="none" w:sz="0" w:space="0" w:color="000000"/>
+                <w:top w:val="none" w:sz="0" w:space="0" w:color="000000"/>
+                <w:left w:val="none" w:sz="0" w:space="0" w:color="000000"/>
+                <w:right w:val="none" w:sz="0" w:space="0" w:color="000000"/>
+              </w:pBdr>
+              <w:spacing w:after="100" w:before="100" w:line="240"/>
+              <w:ind w:left="100" w:right="100" w:firstLine="0" w:firstLineChars="0"/>
+              <w:rPr>
+                <w:rFonts w:ascii="Arial" w:hAnsi="Arial" w:eastAsia="Arial" w:cs="Arial"/>
+                <w:i w:val="false"/>
+                <w:b w:val="false"/>
+                <w:u w:val="none"/>
+                <w:strike w:val="false"/>
+                <w:sz w:val="22"/>
+                <w:szCs w:val="22"/>
+                <w:color w:val="000000"/>
+              </w:rPr>
+            </w:pPr>
+            <w:r>
+              <w:rPr>
+                <w:rFonts w:ascii="Arial" w:hAnsi="Arial" w:eastAsia="Arial" w:cs="Arial"/>
+                <w:i w:val="false"/>
+                <w:b w:val="false"/>
+                <w:u w:val="none"/>
+                <w:strike w:val="false"/>
+                <w:sz w:val="22"/>
+                <w:szCs w:val="22"/>
+                <w:color w:val="000000"/>
+              </w:rPr>
+              <w:t xml:space="preserve">0.4718</w:t>
             </w:r>
           </w:p>
         </w:tc>
@@ -6616,7 +6961,7 @@
                 <w:szCs w:val="22"/>
                 <w:color w:val="000000"/>
               </w:rPr>
-              <w:t xml:space="preserve">cor_golpe_costo_2022_2019</w:t>
+              <w:t xml:space="preserve">spearman_golpe_costo_2022_2019</w:t>
             </w:r>
           </w:p>
         </w:tc>
@@ -6671,7 +7016,7 @@
                 <w:szCs w:val="22"/>
                 <w:color w:val="000000"/>
               </w:rPr>
-              <w:t xml:space="preserve">0.4718</w:t>
+              <w:t xml:space="preserve">0.7543</w:t>
             </w:r>
           </w:p>
         </w:tc>

</xml_diff>